<commit_message>
july finished calendar, ustav scripts update
</commit_message>
<xml_diff>
--- a/docx_resources/Календар/Календар УГКЦ з читаннями 2026 (новоюліанський).docx
+++ b/docx_resources/Календар/Календар УГКЦ з читаннями 2026 (новоюліанський).docx
@@ -30012,18 +30012,80 @@
       <w:pPr>
         <w:rPr>
           <w:rFonts w:ascii="Times New Roman" w:cs="Times New Roman" w:eastAsia="Times New Roman" w:hAnsi="Times New Roman"/>
-          <w:color w:val="ff0000"/>
-        </w:rPr>
-      </w:pPr>
-      <w:r>
-        <w:rPr>
-          <w:rFonts w:ascii="Times New Roman" w:cs="Times New Roman" w:eastAsia="Times New Roman" w:hAnsi="Times New Roman"/>
-          <w:i w:val="1"/>
-          <w:iCs w:val="1"/>
-          <w:color w:val="ff0000"/>
-          <w:rtl w:val="0"/>
-        </w:rPr>
-        <w:t xml:space="preserve">Літ.: Рівноап.:</w:t>
+          <w:i w:val="1"/>
+          <w:iCs w:val="1"/>
+          <w:color w:val="ff0000"/>
+        </w:rPr>
+      </w:pPr>
+      <w:r>
+        <w:rPr>
+          <w:rFonts w:ascii="Times New Roman" w:cs="Times New Roman" w:eastAsia="Times New Roman" w:hAnsi="Times New Roman"/>
+          <w:i w:val="1"/>
+          <w:iCs w:val="1"/>
+          <w:color w:val="ff0000"/>
+          <w:rtl w:val="0"/>
+        </w:rPr>
+        <w:t xml:space="preserve">Літ.:</w:t>
+      </w:r>
+    </w:p>
+    <w:p>
+      <w:pPr>
+        <w:rPr>
+          <w:rFonts w:ascii="Times New Roman" w:cs="Times New Roman" w:eastAsia="Times New Roman" w:hAnsi="Times New Roman"/>
+          <w:color w:val="ff0000"/>
+        </w:rPr>
+      </w:pPr>
+      <w:r>
+        <w:rPr>
+          <w:rFonts w:ascii="Times New Roman" w:cs="Times New Roman" w:eastAsia="Times New Roman" w:hAnsi="Times New Roman"/>
+          <w:i w:val="1"/>
+          <w:iCs w:val="1"/>
+          <w:color w:val="ff0000"/>
+          <w:rtl w:val="0"/>
+        </w:rPr>
+        <w:t xml:space="preserve">Ряд.:</w:t>
+      </w:r>
+      <w:r>
+        <w:rPr>
+          <w:rFonts w:ascii="Times New Roman" w:cs="Times New Roman" w:eastAsia="Times New Roman" w:hAnsi="Times New Roman"/>
+          <w:color w:val="ff0000"/>
+          <w:rtl w:val="0"/>
+        </w:rPr>
+        <w:t xml:space="preserve"> Ап. – 1 Кор. 137 зач.; 7, 12-24.</w:t>
+      </w:r>
+    </w:p>
+    <w:p>
+      <w:pPr>
+        <w:rPr>
+          <w:rFonts w:ascii="Times New Roman" w:cs="Times New Roman" w:eastAsia="Times New Roman" w:hAnsi="Times New Roman"/>
+          <w:color w:val="ff0000"/>
+        </w:rPr>
+      </w:pPr>
+      <w:r>
+        <w:rPr>
+          <w:rFonts w:ascii="Times New Roman" w:cs="Times New Roman" w:eastAsia="Times New Roman" w:hAnsi="Times New Roman"/>
+          <w:color w:val="ff0000"/>
+          <w:rtl w:val="0"/>
+        </w:rPr>
+        <w:t xml:space="preserve">Єв. – Мт. 60 зач.; 14, 35 – 15, 11.</w:t>
+      </w:r>
+    </w:p>
+    <w:p>
+      <w:pPr>
+        <w:rPr>
+          <w:rFonts w:ascii="Times New Roman" w:cs="Times New Roman" w:eastAsia="Times New Roman" w:hAnsi="Times New Roman"/>
+          <w:color w:val="ff0000"/>
+        </w:rPr>
+      </w:pPr>
+      <w:r>
+        <w:rPr>
+          <w:rFonts w:ascii="Times New Roman" w:cs="Times New Roman" w:eastAsia="Times New Roman" w:hAnsi="Times New Roman"/>
+          <w:i w:val="1"/>
+          <w:iCs w:val="1"/>
+          <w:color w:val="ff0000"/>
+          <w:rtl w:val="0"/>
+        </w:rPr>
+        <w:t xml:space="preserve">Рівноап.:</w:t>
       </w:r>
       <w:r>
         <w:rPr>

</xml_diff>